<commit_message>
Update advies v4.1: reflect WCAG compliance, unit tests, Zod, GVC details
- WCAG: 0 violations (was "geen audit")
- Unit tests: 264 tests (was "0% coverage")
- @ts-nocheck: volledig verwijderd (was "deels gefixed")
- Zod validation: 10 API routes (was "geen input sanitization")
- GVC sectie uitgebreid: VNG/HWH vergelijkingstabel, technische details
- Risico R6 (WCAG) en R7 (regressie) kans verlaagd
- Versie 4.1, datum 25 maart 2026
</commit_message>
<xml_diff>
--- a/docs/Advies Voorzieningencatalogus v4.docx
+++ b/docs/Advies Voorzieningencatalogus v4.docx
@@ -314,7 +314,7 @@
                 <w:sz w:val="18"/>
                 <w:szCs w:val="18"/>
               </w:rPr>
-              <w:t xml:space="preserve">24 maart 2026</w:t>
+              <w:t xml:space="preserve">25 maart 2026</w:t>
             </w:r>
           </w:p>
         </w:tc>
@@ -374,7 +374,7 @@
                 <w:sz w:val="18"/>
                 <w:szCs w:val="18"/>
               </w:rPr>
-              <w:t xml:space="preserve">4.0</w:t>
+              <w:t xml:space="preserve">4.1</w:t>
             </w:r>
           </w:p>
         </w:tc>
@@ -1857,7 +1857,7 @@
           <w:sz w:val="20"/>
           <w:szCs w:val="20"/>
         </w:rPr>
-        <w:t xml:space="preserve">@ts-nocheck op enkele grote pagina’s — wordt geleidelijk opgelost (was gemeente detail, nu gedeeltelijk gefixed)</w:t>
+        <w:t xml:space="preserve">@ts-nocheck volledig verwijderd — alle type-errors opgelost, bestanden gesplitst naar &lt;300 regels</w:t>
       </w:r>
     </w:p>
     <w:p>
@@ -1911,7 +1911,7 @@
           <w:sz w:val="20"/>
           <w:szCs w:val="20"/>
         </w:rPr>
-        <w:t xml:space="preserve">Geen unit tests — 0% unit test coverage</w:t>
+        <w:t xml:space="preserve">264 unit tests (Vitest) voor pure functies — maar geen coverage op services/database-laag</w:t>
       </w:r>
     </w:p>
     <w:p>
@@ -1968,7 +1968,7 @@
           <w:sz w:val="20"/>
           <w:szCs w:val="20"/>
         </w:rPr>
-        <w:t xml:space="preserve">Geen accessibility audit (WCAG 2.1 AA) — wettelijk verplicht voor overheidswebsites</w:t>
+        <w:t xml:space="preserve">WCAG-audit uitgevoerd (axe-core: 0 violations) — maar geen externe audit door gecertificeerde partij</w:t>
       </w:r>
     </w:p>
     <w:p>
@@ -2396,7 +2396,7 @@
           <w:sz w:val="20"/>
           <w:szCs w:val="20"/>
         </w:rPr>
-        <w:t xml:space="preserve">Geen input sanitization op alle formulieren — XSS-vectoren mogelijk</w:t>
+        <w:t xml:space="preserve">Zod-validatie op 10 API routes geïmplementeerd — maar nog niet op alle formulieren</w:t>
       </w:r>
     </w:p>
     <w:p>
@@ -3455,7 +3455,66 @@
               <w:bottom w:val="single" w:color="CCCCCC" w:sz="1"/>
               <w:right w:val="single" w:color="CCCCCC" w:sz="1"/>
             </w:tcBorders>
-            <w:shd w:fill="FEF2F2" w:val="clear"/>
+            <w:shd w:fill="F5F5F5" w:val="clear"/>
+            <w:tcMar>
+              <w:top w:type="dxa" w:w="80"/>
+              <w:left w:type="dxa" w:w="120"/>
+              <w:bottom w:type="dxa" w:w="80"/>
+              <w:right w:type="dxa" w:w="120"/>
+            </w:tcMar>
+          </w:tcPr>
+          <w:p>
+            <w:r>
+              <w:rPr>
+                <w:rFonts w:ascii="Arial" w:cs="Arial" w:eastAsia="Arial" w:hAnsi="Arial"/>
+                <w:color w:val="1a1a1a"/>
+                <w:sz w:val="18"/>
+                <w:szCs w:val="18"/>
+              </w:rPr>
+              <w:t xml:space="preserve">Laag</w:t>
+            </w:r>
+          </w:p>
+        </w:tc>
+        <w:tc>
+          <w:tcPr>
+            <w:tcW w:type="dxa" w:w="3426"/>
+            <w:tcBorders>
+              <w:top w:val="single" w:color="CCCCCC" w:sz="1"/>
+              <w:left w:val="single" w:color="CCCCCC" w:sz="1"/>
+              <w:bottom w:val="single" w:color="CCCCCC" w:sz="1"/>
+              <w:right w:val="single" w:color="CCCCCC" w:sz="1"/>
+            </w:tcBorders>
+            <w:shd w:fill="F5F5F5" w:val="clear"/>
+            <w:tcMar>
+              <w:top w:type="dxa" w:w="80"/>
+              <w:left w:type="dxa" w:w="120"/>
+              <w:bottom w:type="dxa" w:w="80"/>
+              <w:right w:type="dxa" w:w="120"/>
+            </w:tcMar>
+          </w:tcPr>
+          <w:p>
+            <w:r>
+              <w:rPr>
+                <w:rFonts w:ascii="Arial" w:cs="Arial" w:eastAsia="Arial" w:hAnsi="Arial"/>
+                <w:color w:val="1a1a1a"/>
+                <w:sz w:val="18"/>
+                <w:szCs w:val="18"/>
+              </w:rPr>
+              <w:t xml:space="preserve">Basis geïmplementeerd (axe-core 0 violations). Externe audit nog nodig</w:t>
+            </w:r>
+          </w:p>
+        </w:tc>
+      </w:tr>
+      <w:tr>
+        <w:tc>
+          <w:tcPr>
+            <w:tcW w:type="dxa" w:w="400"/>
+            <w:tcBorders>
+              <w:top w:val="single" w:color="CCCCCC" w:sz="1"/>
+              <w:left w:val="single" w:color="CCCCCC" w:sz="1"/>
+              <w:bottom w:val="single" w:color="CCCCCC" w:sz="1"/>
+              <w:right w:val="single" w:color="CCCCCC" w:sz="1"/>
+            </w:tcBorders>
             <w:tcMar>
               <w:top w:type="dxa" w:w="80"/>
               <w:left w:type="dxa" w:w="120"/>
@@ -3469,11 +3528,95 @@
                 <w:rFonts w:ascii="Arial" w:cs="Arial" w:eastAsia="Arial" w:hAnsi="Arial"/>
                 <w:b/>
                 <w:bCs/>
-                <w:color w:val="991B1B"/>
-                <w:sz w:val="18"/>
-                <w:szCs w:val="18"/>
-              </w:rPr>
-              <w:t xml:space="preserve">Hoog</w:t>
+                <w:color w:val="1a1a1a"/>
+                <w:sz w:val="18"/>
+                <w:szCs w:val="18"/>
+              </w:rPr>
+              <w:t xml:space="preserve">R7</w:t>
+            </w:r>
+          </w:p>
+        </w:tc>
+        <w:tc>
+          <w:tcPr>
+            <w:tcW w:type="dxa" w:w="3200"/>
+            <w:tcBorders>
+              <w:top w:val="single" w:color="CCCCCC" w:sz="1"/>
+              <w:left w:val="single" w:color="CCCCCC" w:sz="1"/>
+              <w:bottom w:val="single" w:color="CCCCCC" w:sz="1"/>
+              <w:right w:val="single" w:color="CCCCCC" w:sz="1"/>
+            </w:tcBorders>
+            <w:tcMar>
+              <w:top w:type="dxa" w:w="80"/>
+              <w:left w:type="dxa" w:w="120"/>
+              <w:bottom w:type="dxa" w:w="80"/>
+              <w:right w:type="dxa" w:w="120"/>
+            </w:tcMar>
+          </w:tcPr>
+          <w:p>
+            <w:r>
+              <w:rPr>
+                <w:rFonts w:ascii="Arial" w:cs="Arial" w:eastAsia="Arial" w:hAnsi="Arial"/>
+                <w:color w:val="1a1a1a"/>
+                <w:sz w:val="18"/>
+                <w:szCs w:val="18"/>
+              </w:rPr>
+              <w:t xml:space="preserve">Regressie door ontbreken tests bij doorontwikkeling</w:t>
+            </w:r>
+          </w:p>
+        </w:tc>
+        <w:tc>
+          <w:tcPr>
+            <w:tcW w:type="dxa" w:w="1000"/>
+            <w:tcBorders>
+              <w:top w:val="single" w:color="CCCCCC" w:sz="1"/>
+              <w:left w:val="single" w:color="CCCCCC" w:sz="1"/>
+              <w:bottom w:val="single" w:color="CCCCCC" w:sz="1"/>
+              <w:right w:val="single" w:color="CCCCCC" w:sz="1"/>
+            </w:tcBorders>
+            <w:tcMar>
+              <w:top w:type="dxa" w:w="80"/>
+              <w:left w:type="dxa" w:w="120"/>
+              <w:bottom w:type="dxa" w:w="80"/>
+              <w:right w:type="dxa" w:w="120"/>
+            </w:tcMar>
+          </w:tcPr>
+          <w:p>
+            <w:r>
+              <w:rPr>
+                <w:rFonts w:ascii="Arial" w:cs="Arial" w:eastAsia="Arial" w:hAnsi="Arial"/>
+                <w:color w:val="1a1a1a"/>
+                <w:sz w:val="18"/>
+                <w:szCs w:val="18"/>
+              </w:rPr>
+              <w:t xml:space="preserve">Medium</w:t>
+            </w:r>
+          </w:p>
+        </w:tc>
+        <w:tc>
+          <w:tcPr>
+            <w:tcW w:type="dxa" w:w="1000"/>
+            <w:tcBorders>
+              <w:top w:val="single" w:color="CCCCCC" w:sz="1"/>
+              <w:left w:val="single" w:color="CCCCCC" w:sz="1"/>
+              <w:bottom w:val="single" w:color="CCCCCC" w:sz="1"/>
+              <w:right w:val="single" w:color="CCCCCC" w:sz="1"/>
+            </w:tcBorders>
+            <w:tcMar>
+              <w:top w:type="dxa" w:w="80"/>
+              <w:left w:type="dxa" w:w="120"/>
+              <w:bottom w:type="dxa" w:w="80"/>
+              <w:right w:type="dxa" w:w="120"/>
+            </w:tcMar>
+          </w:tcPr>
+          <w:p>
+            <w:r>
+              <w:rPr>
+                <w:rFonts w:ascii="Arial" w:cs="Arial" w:eastAsia="Arial" w:hAnsi="Arial"/>
+                <w:color w:val="1a1a1a"/>
+                <w:sz w:val="18"/>
+                <w:szCs w:val="18"/>
+              </w:rPr>
+              <w:t xml:space="preserve">Medium</w:t>
             </w:r>
           </w:p>
         </w:tc>
@@ -3486,170 +3629,22 @@
               <w:bottom w:val="single" w:color="CCCCCC" w:sz="1"/>
               <w:right w:val="single" w:color="CCCCCC" w:sz="1"/>
             </w:tcBorders>
-            <w:shd w:fill="F5F5F5" w:val="clear"/>
-            <w:tcMar>
-              <w:top w:type="dxa" w:w="80"/>
-              <w:left w:type="dxa" w:w="120"/>
-              <w:bottom w:type="dxa" w:w="80"/>
-              <w:right w:type="dxa" w:w="120"/>
-            </w:tcMar>
-          </w:tcPr>
-          <w:p>
-            <w:r>
-              <w:rPr>
-                <w:rFonts w:ascii="Arial" w:cs="Arial" w:eastAsia="Arial" w:hAnsi="Arial"/>
-                <w:color w:val="1a1a1a"/>
-                <w:sz w:val="18"/>
-                <w:szCs w:val="18"/>
-              </w:rPr>
-              <w:t xml:space="preserve">Externe WCAG-audit en fixes</w:t>
-            </w:r>
-          </w:p>
-        </w:tc>
-      </w:tr>
-      <w:tr>
-        <w:tc>
-          <w:tcPr>
-            <w:tcW w:type="dxa" w:w="400"/>
-            <w:tcBorders>
-              <w:top w:val="single" w:color="CCCCCC" w:sz="1"/>
-              <w:left w:val="single" w:color="CCCCCC" w:sz="1"/>
-              <w:bottom w:val="single" w:color="CCCCCC" w:sz="1"/>
-              <w:right w:val="single" w:color="CCCCCC" w:sz="1"/>
-            </w:tcBorders>
-            <w:tcMar>
-              <w:top w:type="dxa" w:w="80"/>
-              <w:left w:type="dxa" w:w="120"/>
-              <w:bottom w:type="dxa" w:w="80"/>
-              <w:right w:type="dxa" w:w="120"/>
-            </w:tcMar>
-          </w:tcPr>
-          <w:p>
-            <w:r>
-              <w:rPr>
-                <w:rFonts w:ascii="Arial" w:cs="Arial" w:eastAsia="Arial" w:hAnsi="Arial"/>
-                <w:b/>
-                <w:bCs/>
-                <w:color w:val="1a1a1a"/>
-                <w:sz w:val="18"/>
-                <w:szCs w:val="18"/>
-              </w:rPr>
-              <w:t xml:space="preserve">R7</w:t>
-            </w:r>
-          </w:p>
-        </w:tc>
-        <w:tc>
-          <w:tcPr>
-            <w:tcW w:type="dxa" w:w="3200"/>
-            <w:tcBorders>
-              <w:top w:val="single" w:color="CCCCCC" w:sz="1"/>
-              <w:left w:val="single" w:color="CCCCCC" w:sz="1"/>
-              <w:bottom w:val="single" w:color="CCCCCC" w:sz="1"/>
-              <w:right w:val="single" w:color="CCCCCC" w:sz="1"/>
-            </w:tcBorders>
-            <w:tcMar>
-              <w:top w:type="dxa" w:w="80"/>
-              <w:left w:type="dxa" w:w="120"/>
-              <w:bottom w:type="dxa" w:w="80"/>
-              <w:right w:type="dxa" w:w="120"/>
-            </w:tcMar>
-          </w:tcPr>
-          <w:p>
-            <w:r>
-              <w:rPr>
-                <w:rFonts w:ascii="Arial" w:cs="Arial" w:eastAsia="Arial" w:hAnsi="Arial"/>
-                <w:color w:val="1a1a1a"/>
-                <w:sz w:val="18"/>
-                <w:szCs w:val="18"/>
-              </w:rPr>
-              <w:t xml:space="preserve">Regressie door ontbreken tests bij doorontwikkeling</w:t>
-            </w:r>
-          </w:p>
-        </w:tc>
-        <w:tc>
-          <w:tcPr>
-            <w:tcW w:type="dxa" w:w="1000"/>
-            <w:tcBorders>
-              <w:top w:val="single" w:color="CCCCCC" w:sz="1"/>
-              <w:left w:val="single" w:color="CCCCCC" w:sz="1"/>
-              <w:bottom w:val="single" w:color="CCCCCC" w:sz="1"/>
-              <w:right w:val="single" w:color="CCCCCC" w:sz="1"/>
-            </w:tcBorders>
-            <w:tcMar>
-              <w:top w:type="dxa" w:w="80"/>
-              <w:left w:type="dxa" w:w="120"/>
-              <w:bottom w:type="dxa" w:w="80"/>
-              <w:right w:type="dxa" w:w="120"/>
-            </w:tcMar>
-          </w:tcPr>
-          <w:p>
-            <w:r>
-              <w:rPr>
-                <w:rFonts w:ascii="Arial" w:cs="Arial" w:eastAsia="Arial" w:hAnsi="Arial"/>
-                <w:color w:val="1a1a1a"/>
-                <w:sz w:val="18"/>
-                <w:szCs w:val="18"/>
-              </w:rPr>
-              <w:t xml:space="preserve">Medium</w:t>
-            </w:r>
-          </w:p>
-        </w:tc>
-        <w:tc>
-          <w:tcPr>
-            <w:tcW w:type="dxa" w:w="1000"/>
-            <w:tcBorders>
-              <w:top w:val="single" w:color="CCCCCC" w:sz="1"/>
-              <w:left w:val="single" w:color="CCCCCC" w:sz="1"/>
-              <w:bottom w:val="single" w:color="CCCCCC" w:sz="1"/>
-              <w:right w:val="single" w:color="CCCCCC" w:sz="1"/>
-            </w:tcBorders>
-            <w:shd w:fill="FEF2F2" w:val="clear"/>
-            <w:tcMar>
-              <w:top w:type="dxa" w:w="80"/>
-              <w:left w:type="dxa" w:w="120"/>
-              <w:bottom w:type="dxa" w:w="80"/>
-              <w:right w:type="dxa" w:w="120"/>
-            </w:tcMar>
-          </w:tcPr>
-          <w:p>
-            <w:r>
-              <w:rPr>
-                <w:rFonts w:ascii="Arial" w:cs="Arial" w:eastAsia="Arial" w:hAnsi="Arial"/>
-                <w:b/>
-                <w:bCs/>
-                <w:color w:val="991B1B"/>
-                <w:sz w:val="18"/>
-                <w:szCs w:val="18"/>
-              </w:rPr>
-              <w:t xml:space="preserve">Hoog</w:t>
-            </w:r>
-          </w:p>
-        </w:tc>
-        <w:tc>
-          <w:tcPr>
-            <w:tcW w:type="dxa" w:w="3426"/>
-            <w:tcBorders>
-              <w:top w:val="single" w:color="CCCCCC" w:sz="1"/>
-              <w:left w:val="single" w:color="CCCCCC" w:sz="1"/>
-              <w:bottom w:val="single" w:color="CCCCCC" w:sz="1"/>
-              <w:right w:val="single" w:color="CCCCCC" w:sz="1"/>
-            </w:tcBorders>
-            <w:tcMar>
-              <w:top w:type="dxa" w:w="80"/>
-              <w:left w:type="dxa" w:w="120"/>
-              <w:bottom w:type="dxa" w:w="80"/>
-              <w:right w:type="dxa" w:w="120"/>
-            </w:tcMar>
-          </w:tcPr>
-          <w:p>
-            <w:r>
-              <w:rPr>
-                <w:rFonts w:ascii="Arial" w:cs="Arial" w:eastAsia="Arial" w:hAnsi="Arial"/>
-                <w:color w:val="1a1a1a"/>
-                <w:sz w:val="18"/>
-                <w:szCs w:val="18"/>
-              </w:rPr>
-              <w:t xml:space="preserve">Testsuite uitbreiden (&gt;70% coverage)</w:t>
+            <w:tcMar>
+              <w:top w:type="dxa" w:w="80"/>
+              <w:left w:type="dxa" w:w="120"/>
+              <w:bottom w:type="dxa" w:w="80"/>
+              <w:right w:type="dxa" w:w="120"/>
+            </w:tcMar>
+          </w:tcPr>
+          <w:p>
+            <w:r>
+              <w:rPr>
+                <w:rFonts w:ascii="Arial" w:cs="Arial" w:eastAsia="Arial" w:hAnsi="Arial"/>
+                <w:color w:val="1a1a1a"/>
+                <w:sz w:val="18"/>
+                <w:szCs w:val="18"/>
+              </w:rPr>
+              <w:t xml:space="preserve">264 unit tests + 26 E2E tests. Coverage services-laag nog onvoldoende</w:t>
             </w:r>
           </w:p>
         </w:tc>
@@ -10115,7 +10110,7 @@
           <w:sz w:val="20"/>
           <w:szCs w:val="20"/>
         </w:rPr>
-        <w:t xml:space="preserve">De belangrijkste risico’s — ontbrekende MFA, geen BIO-toetsing, geen penetratietest, geen WCAG-audit, geen backupstrategie — zijn elk op zichzelf voldoende reden om niet in productie te gaan. Gezamenlijk vormen ze een onacceptabel risicoprofiel voor een systeem dat door honderden overheidsorganisaties wordt gebruikt.</w:t>
+        <w:t xml:space="preserve">De belangrijkste resterende risico’s — ontbrekende MFA, geen BIO-toetsing, geen penetratietest, geen backupstrategie — zijn elk op zichzelf voldoende reden om niet in productie te gaan. WCAG-compliance is inmiddels geïmplementeerd (axe-core: 0 violations), unit tests zijn toegevoegd (264 tests), en input-validatie is versterkt (Zod). Het risicoprofiel is verbeterd maar nog niet acceptabel voor productie.</w:t>
       </w:r>
     </w:p>
     <w:p>
@@ -10272,8 +10267,665 @@
           <w:sz w:val="20"/>
           <w:szCs w:val="20"/>
         </w:rPr>
-        <w:t xml:space="preserve">De codebase is geëxtraheerd naar een generieke library (GVC) met 219 bestanden. Deze library maakt het mogelijk om de Voorzieningencatalogus in te zetten voor andere publieke sectoren — waterschappen (Het Waterschapshuis), provincies, onderwijs — door alleen een tenant-configuratie en branding aan te passen. De GVC ondersteunt multi-tenant architectuur met configureerbare rollen, architectuurmodel-sync (GEMMA/WILMA) en domein-specifieke routes.</w:t>
-      </w:r>
+        <w:t xml:space="preserve">De codebase is geëxtraheerd naar een generieke library (GVC) die hergebruik voor andere publieke sectoren mogelijk maakt. Het datamodel gebruikt nu ‘Organisatie’ als generiek basismodel (met @@map() voor backward-compatibiliteit met bestaande databases). Twee operationele varianten zijn gerealiseerd:</w:t>
+      </w:r>
+    </w:p>
+    <w:p>
+      <w:pPr>
+        <w:spacing w:before="40"/>
+      </w:pPr>
+    </w:p>
+    <w:tbl>
+      <w:tblPr>
+        <w:tblW w:type="dxa" w:w="9026"/>
+        <w:tblBorders>
+          <w:top w:val="single" w:color="auto" w:sz="4"/>
+          <w:left w:val="single" w:color="auto" w:sz="4"/>
+          <w:bottom w:val="single" w:color="auto" w:sz="4"/>
+          <w:right w:val="single" w:color="auto" w:sz="4"/>
+          <w:insideH w:val="single" w:color="auto" w:sz="4"/>
+          <w:insideV w:val="single" w:color="auto" w:sz="4"/>
+        </w:tblBorders>
+      </w:tblPr>
+      <w:tblGrid>
+        <w:gridCol w:w="1800"/>
+        <w:gridCol w:w="3613"/>
+        <w:gridCol w:w="3613"/>
+      </w:tblGrid>
+      <w:tr>
+        <w:tc>
+          <w:tcPr>
+            <w:tcW w:type="dxa" w:w="1800"/>
+            <w:tcBorders>
+              <w:top w:val="single" w:color="CCCCCC" w:sz="1"/>
+              <w:left w:val="single" w:color="CCCCCC" w:sz="1"/>
+              <w:bottom w:val="single" w:color="CCCCCC" w:sz="1"/>
+              <w:right w:val="single" w:color="CCCCCC" w:sz="1"/>
+            </w:tcBorders>
+            <w:shd w:fill="1a6ca8" w:val="clear"/>
+            <w:tcMar>
+              <w:top w:type="dxa" w:w="80"/>
+              <w:left w:type="dxa" w:w="120"/>
+              <w:bottom w:type="dxa" w:w="80"/>
+              <w:right w:type="dxa" w:w="120"/>
+            </w:tcMar>
+          </w:tcPr>
+          <w:p>
+            <w:r>
+              <w:rPr>
+                <w:rFonts w:ascii="Arial" w:cs="Arial" w:eastAsia="Arial" w:hAnsi="Arial"/>
+                <w:b/>
+                <w:bCs/>
+                <w:color w:val="FFFFFF"/>
+                <w:sz w:val="18"/>
+                <w:szCs w:val="18"/>
+              </w:rPr>
+              <w:t xml:space="preserve"/>
+            </w:r>
+          </w:p>
+        </w:tc>
+        <w:tc>
+          <w:tcPr>
+            <w:tcW w:type="dxa" w:w="3613"/>
+            <w:tcBorders>
+              <w:top w:val="single" w:color="CCCCCC" w:sz="1"/>
+              <w:left w:val="single" w:color="CCCCCC" w:sz="1"/>
+              <w:bottom w:val="single" w:color="CCCCCC" w:sz="1"/>
+              <w:right w:val="single" w:color="CCCCCC" w:sz="1"/>
+            </w:tcBorders>
+            <w:shd w:fill="1a6ca8" w:val="clear"/>
+            <w:tcMar>
+              <w:top w:type="dxa" w:w="80"/>
+              <w:left w:type="dxa" w:w="120"/>
+              <w:bottom w:type="dxa" w:w="80"/>
+              <w:right w:type="dxa" w:w="120"/>
+            </w:tcMar>
+          </w:tcPr>
+          <w:p>
+            <w:r>
+              <w:rPr>
+                <w:rFonts w:ascii="Arial" w:cs="Arial" w:eastAsia="Arial" w:hAnsi="Arial"/>
+                <w:b/>
+                <w:bCs/>
+                <w:color w:val="FFFFFF"/>
+                <w:sz w:val="18"/>
+                <w:szCs w:val="18"/>
+              </w:rPr>
+              <w:t xml:space="preserve">VNG (gemeenten)</w:t>
+            </w:r>
+          </w:p>
+        </w:tc>
+        <w:tc>
+          <w:tcPr>
+            <w:tcW w:type="dxa" w:w="3613"/>
+            <w:tcBorders>
+              <w:top w:val="single" w:color="CCCCCC" w:sz="1"/>
+              <w:left w:val="single" w:color="CCCCCC" w:sz="1"/>
+              <w:bottom w:val="single" w:color="CCCCCC" w:sz="1"/>
+              <w:right w:val="single" w:color="CCCCCC" w:sz="1"/>
+            </w:tcBorders>
+            <w:shd w:fill="1a6ca8" w:val="clear"/>
+            <w:tcMar>
+              <w:top w:type="dxa" w:w="80"/>
+              <w:left w:type="dxa" w:w="120"/>
+              <w:bottom w:type="dxa" w:w="80"/>
+              <w:right w:type="dxa" w:w="120"/>
+            </w:tcMar>
+          </w:tcPr>
+          <w:p>
+            <w:r>
+              <w:rPr>
+                <w:rFonts w:ascii="Arial" w:cs="Arial" w:eastAsia="Arial" w:hAnsi="Arial"/>
+                <w:b/>
+                <w:bCs/>
+                <w:color w:val="FFFFFF"/>
+                <w:sz w:val="18"/>
+                <w:szCs w:val="18"/>
+              </w:rPr>
+              <w:t xml:space="preserve">HWH (waterschappen)</w:t>
+            </w:r>
+          </w:p>
+        </w:tc>
+      </w:tr>
+      <w:tr>
+        <w:tc>
+          <w:tcPr>
+            <w:tcW w:type="dxa" w:w="1800"/>
+            <w:tcBorders>
+              <w:top w:val="single" w:color="CCCCCC" w:sz="1"/>
+              <w:left w:val="single" w:color="CCCCCC" w:sz="1"/>
+              <w:bottom w:val="single" w:color="CCCCCC" w:sz="1"/>
+              <w:right w:val="single" w:color="CCCCCC" w:sz="1"/>
+            </w:tcBorders>
+            <w:tcMar>
+              <w:top w:type="dxa" w:w="80"/>
+              <w:left w:type="dxa" w:w="120"/>
+              <w:bottom w:type="dxa" w:w="80"/>
+              <w:right w:type="dxa" w:w="120"/>
+            </w:tcMar>
+          </w:tcPr>
+          <w:p>
+            <w:r>
+              <w:rPr>
+                <w:rFonts w:ascii="Arial" w:cs="Arial" w:eastAsia="Arial" w:hAnsi="Arial"/>
+                <w:b/>
+                <w:bCs/>
+                <w:color w:val="1a1a1a"/>
+                <w:sz w:val="18"/>
+                <w:szCs w:val="18"/>
+              </w:rPr>
+              <w:t xml:space="preserve">URL</w:t>
+            </w:r>
+          </w:p>
+        </w:tc>
+        <w:tc>
+          <w:tcPr>
+            <w:tcW w:type="dxa" w:w="3613"/>
+            <w:tcBorders>
+              <w:top w:val="single" w:color="CCCCCC" w:sz="1"/>
+              <w:left w:val="single" w:color="CCCCCC" w:sz="1"/>
+              <w:bottom w:val="single" w:color="CCCCCC" w:sz="1"/>
+              <w:right w:val="single" w:color="CCCCCC" w:sz="1"/>
+            </w:tcBorders>
+            <w:tcMar>
+              <w:top w:type="dxa" w:w="80"/>
+              <w:left w:type="dxa" w:w="120"/>
+              <w:bottom w:type="dxa" w:w="80"/>
+              <w:right w:type="dxa" w:w="120"/>
+            </w:tcMar>
+          </w:tcPr>
+          <w:p>
+            <w:r>
+              <w:rPr>
+                <w:rFonts w:ascii="Arial" w:cs="Arial" w:eastAsia="Arial" w:hAnsi="Arial"/>
+                <w:color w:val="1a1a1a"/>
+                <w:sz w:val="18"/>
+                <w:szCs w:val="18"/>
+              </w:rPr>
+              <w:t xml:space="preserve">vng-vc.vercel.app</w:t>
+            </w:r>
+          </w:p>
+        </w:tc>
+        <w:tc>
+          <w:tcPr>
+            <w:tcW w:type="dxa" w:w="3613"/>
+            <w:tcBorders>
+              <w:top w:val="single" w:color="CCCCCC" w:sz="1"/>
+              <w:left w:val="single" w:color="CCCCCC" w:sz="1"/>
+              <w:bottom w:val="single" w:color="CCCCCC" w:sz="1"/>
+              <w:right w:val="single" w:color="CCCCCC" w:sz="1"/>
+            </w:tcBorders>
+            <w:tcMar>
+              <w:top w:type="dxa" w:w="80"/>
+              <w:left w:type="dxa" w:w="120"/>
+              <w:bottom w:type="dxa" w:w="80"/>
+              <w:right w:type="dxa" w:w="120"/>
+            </w:tcMar>
+          </w:tcPr>
+          <w:p>
+            <w:r>
+              <w:rPr>
+                <w:rFonts w:ascii="Arial" w:cs="Arial" w:eastAsia="Arial" w:hAnsi="Arial"/>
+                <w:color w:val="1a1a1a"/>
+                <w:sz w:val="18"/>
+                <w:szCs w:val="18"/>
+              </w:rPr>
+              <w:t xml:space="preserve">hwh-teal.vercel.app</w:t>
+            </w:r>
+          </w:p>
+        </w:tc>
+      </w:tr>
+      <w:tr>
+        <w:tc>
+          <w:tcPr>
+            <w:tcW w:type="dxa" w:w="1800"/>
+            <w:tcBorders>
+              <w:top w:val="single" w:color="CCCCCC" w:sz="1"/>
+              <w:left w:val="single" w:color="CCCCCC" w:sz="1"/>
+              <w:bottom w:val="single" w:color="CCCCCC" w:sz="1"/>
+              <w:right w:val="single" w:color="CCCCCC" w:sz="1"/>
+            </w:tcBorders>
+            <w:tcMar>
+              <w:top w:type="dxa" w:w="80"/>
+              <w:left w:type="dxa" w:w="120"/>
+              <w:bottom w:type="dxa" w:w="80"/>
+              <w:right w:type="dxa" w:w="120"/>
+            </w:tcMar>
+          </w:tcPr>
+          <w:p>
+            <w:r>
+              <w:rPr>
+                <w:rFonts w:ascii="Arial" w:cs="Arial" w:eastAsia="Arial" w:hAnsi="Arial"/>
+                <w:b/>
+                <w:bCs/>
+                <w:color w:val="1a1a1a"/>
+                <w:sz w:val="18"/>
+                <w:szCs w:val="18"/>
+              </w:rPr>
+              <w:t xml:space="preserve">Organisaties</w:t>
+            </w:r>
+          </w:p>
+        </w:tc>
+        <w:tc>
+          <w:tcPr>
+            <w:tcW w:type="dxa" w:w="3613"/>
+            <w:tcBorders>
+              <w:top w:val="single" w:color="CCCCCC" w:sz="1"/>
+              <w:left w:val="single" w:color="CCCCCC" w:sz="1"/>
+              <w:bottom w:val="single" w:color="CCCCCC" w:sz="1"/>
+              <w:right w:val="single" w:color="CCCCCC" w:sz="1"/>
+            </w:tcBorders>
+            <w:shd w:fill="F5F5F5" w:val="clear"/>
+            <w:tcMar>
+              <w:top w:type="dxa" w:w="80"/>
+              <w:left w:type="dxa" w:w="120"/>
+              <w:bottom w:type="dxa" w:w="80"/>
+              <w:right w:type="dxa" w:w="120"/>
+            </w:tcMar>
+          </w:tcPr>
+          <w:p>
+            <w:r>
+              <w:rPr>
+                <w:rFonts w:ascii="Arial" w:cs="Arial" w:eastAsia="Arial" w:hAnsi="Arial"/>
+                <w:color w:val="1a1a1a"/>
+                <w:sz w:val="18"/>
+                <w:szCs w:val="18"/>
+              </w:rPr>
+              <w:t xml:space="preserve">342 gemeenten</w:t>
+            </w:r>
+          </w:p>
+        </w:tc>
+        <w:tc>
+          <w:tcPr>
+            <w:tcW w:type="dxa" w:w="3613"/>
+            <w:tcBorders>
+              <w:top w:val="single" w:color="CCCCCC" w:sz="1"/>
+              <w:left w:val="single" w:color="CCCCCC" w:sz="1"/>
+              <w:bottom w:val="single" w:color="CCCCCC" w:sz="1"/>
+              <w:right w:val="single" w:color="CCCCCC" w:sz="1"/>
+            </w:tcBorders>
+            <w:shd w:fill="F5F5F5" w:val="clear"/>
+            <w:tcMar>
+              <w:top w:type="dxa" w:w="80"/>
+              <w:left w:type="dxa" w:w="120"/>
+              <w:bottom w:type="dxa" w:w="80"/>
+              <w:right w:type="dxa" w:w="120"/>
+            </w:tcMar>
+          </w:tcPr>
+          <w:p>
+            <w:r>
+              <w:rPr>
+                <w:rFonts w:ascii="Arial" w:cs="Arial" w:eastAsia="Arial" w:hAnsi="Arial"/>
+                <w:color w:val="1a1a1a"/>
+                <w:sz w:val="18"/>
+                <w:szCs w:val="18"/>
+              </w:rPr>
+              <w:t xml:space="preserve">21 waterschappen</w:t>
+            </w:r>
+          </w:p>
+        </w:tc>
+      </w:tr>
+      <w:tr>
+        <w:tc>
+          <w:tcPr>
+            <w:tcW w:type="dxa" w:w="1800"/>
+            <w:tcBorders>
+              <w:top w:val="single" w:color="CCCCCC" w:sz="1"/>
+              <w:left w:val="single" w:color="CCCCCC" w:sz="1"/>
+              <w:bottom w:val="single" w:color="CCCCCC" w:sz="1"/>
+              <w:right w:val="single" w:color="CCCCCC" w:sz="1"/>
+            </w:tcBorders>
+            <w:tcMar>
+              <w:top w:type="dxa" w:w="80"/>
+              <w:left w:type="dxa" w:w="120"/>
+              <w:bottom w:type="dxa" w:w="80"/>
+              <w:right w:type="dxa" w:w="120"/>
+            </w:tcMar>
+          </w:tcPr>
+          <w:p>
+            <w:r>
+              <w:rPr>
+                <w:rFonts w:ascii="Arial" w:cs="Arial" w:eastAsia="Arial" w:hAnsi="Arial"/>
+                <w:b/>
+                <w:bCs/>
+                <w:color w:val="1a1a1a"/>
+                <w:sz w:val="18"/>
+                <w:szCs w:val="18"/>
+              </w:rPr>
+              <w:t xml:space="preserve">Architectuur-sync</w:t>
+            </w:r>
+          </w:p>
+        </w:tc>
+        <w:tc>
+          <w:tcPr>
+            <w:tcW w:type="dxa" w:w="3613"/>
+            <w:tcBorders>
+              <w:top w:val="single" w:color="CCCCCC" w:sz="1"/>
+              <w:left w:val="single" w:color="CCCCCC" w:sz="1"/>
+              <w:bottom w:val="single" w:color="CCCCCC" w:sz="1"/>
+              <w:right w:val="single" w:color="CCCCCC" w:sz="1"/>
+            </w:tcBorders>
+            <w:tcMar>
+              <w:top w:type="dxa" w:w="80"/>
+              <w:left w:type="dxa" w:w="120"/>
+              <w:bottom w:type="dxa" w:w="80"/>
+              <w:right w:type="dxa" w:w="120"/>
+            </w:tcMar>
+          </w:tcPr>
+          <w:p>
+            <w:r>
+              <w:rPr>
+                <w:rFonts w:ascii="Arial" w:cs="Arial" w:eastAsia="Arial" w:hAnsi="Arial"/>
+                <w:color w:val="1a1a1a"/>
+                <w:sz w:val="18"/>
+                <w:szCs w:val="18"/>
+              </w:rPr>
+              <w:t xml:space="preserve">GEMMA (gemmaonline.nl)</w:t>
+            </w:r>
+          </w:p>
+        </w:tc>
+        <w:tc>
+          <w:tcPr>
+            <w:tcW w:type="dxa" w:w="3613"/>
+            <w:tcBorders>
+              <w:top w:val="single" w:color="CCCCCC" w:sz="1"/>
+              <w:left w:val="single" w:color="CCCCCC" w:sz="1"/>
+              <w:bottom w:val="single" w:color="CCCCCC" w:sz="1"/>
+              <w:right w:val="single" w:color="CCCCCC" w:sz="1"/>
+            </w:tcBorders>
+            <w:tcMar>
+              <w:top w:type="dxa" w:w="80"/>
+              <w:left w:type="dxa" w:w="120"/>
+              <w:bottom w:type="dxa" w:w="80"/>
+              <w:right w:type="dxa" w:w="120"/>
+            </w:tcMar>
+          </w:tcPr>
+          <w:p>
+            <w:r>
+              <w:rPr>
+                <w:rFonts w:ascii="Arial" w:cs="Arial" w:eastAsia="Arial" w:hAnsi="Arial"/>
+                <w:color w:val="1a1a1a"/>
+                <w:sz w:val="18"/>
+                <w:szCs w:val="18"/>
+              </w:rPr>
+              <w:t xml:space="preserve">WILMA (wilmaonline.nl)</w:t>
+            </w:r>
+          </w:p>
+        </w:tc>
+      </w:tr>
+      <w:tr>
+        <w:tc>
+          <w:tcPr>
+            <w:tcW w:type="dxa" w:w="1800"/>
+            <w:tcBorders>
+              <w:top w:val="single" w:color="CCCCCC" w:sz="1"/>
+              <w:left w:val="single" w:color="CCCCCC" w:sz="1"/>
+              <w:bottom w:val="single" w:color="CCCCCC" w:sz="1"/>
+              <w:right w:val="single" w:color="CCCCCC" w:sz="1"/>
+            </w:tcBorders>
+            <w:tcMar>
+              <w:top w:type="dxa" w:w="80"/>
+              <w:left w:type="dxa" w:w="120"/>
+              <w:bottom w:type="dxa" w:w="80"/>
+              <w:right w:type="dxa" w:w="120"/>
+            </w:tcMar>
+          </w:tcPr>
+          <w:p>
+            <w:r>
+              <w:rPr>
+                <w:rFonts w:ascii="Arial" w:cs="Arial" w:eastAsia="Arial" w:hAnsi="Arial"/>
+                <w:b/>
+                <w:bCs/>
+                <w:color w:val="1a1a1a"/>
+                <w:sz w:val="18"/>
+                <w:szCs w:val="18"/>
+              </w:rPr>
+              <w:t xml:space="preserve">Routes</w:t>
+            </w:r>
+          </w:p>
+        </w:tc>
+        <w:tc>
+          <w:tcPr>
+            <w:tcW w:type="dxa" w:w="3613"/>
+            <w:tcBorders>
+              <w:top w:val="single" w:color="CCCCCC" w:sz="1"/>
+              <w:left w:val="single" w:color="CCCCCC" w:sz="1"/>
+              <w:bottom w:val="single" w:color="CCCCCC" w:sz="1"/>
+              <w:right w:val="single" w:color="CCCCCC" w:sz="1"/>
+            </w:tcBorders>
+            <w:shd w:fill="F5F5F5" w:val="clear"/>
+            <w:tcMar>
+              <w:top w:type="dxa" w:w="80"/>
+              <w:left w:type="dxa" w:w="120"/>
+              <w:bottom w:type="dxa" w:w="80"/>
+              <w:right w:type="dxa" w:w="120"/>
+            </w:tcMar>
+          </w:tcPr>
+          <w:p>
+            <w:r>
+              <w:rPr>
+                <w:rFonts w:ascii="Arial" w:cs="Arial" w:eastAsia="Arial" w:hAnsi="Arial"/>
+                <w:color w:val="1a1a1a"/>
+                <w:sz w:val="18"/>
+                <w:szCs w:val="18"/>
+              </w:rPr>
+              <w:t xml:space="preserve">/gemeenten</w:t>
+            </w:r>
+          </w:p>
+        </w:tc>
+        <w:tc>
+          <w:tcPr>
+            <w:tcW w:type="dxa" w:w="3613"/>
+            <w:tcBorders>
+              <w:top w:val="single" w:color="CCCCCC" w:sz="1"/>
+              <w:left w:val="single" w:color="CCCCCC" w:sz="1"/>
+              <w:bottom w:val="single" w:color="CCCCCC" w:sz="1"/>
+              <w:right w:val="single" w:color="CCCCCC" w:sz="1"/>
+            </w:tcBorders>
+            <w:shd w:fill="F5F5F5" w:val="clear"/>
+            <w:tcMar>
+              <w:top w:type="dxa" w:w="80"/>
+              <w:left w:type="dxa" w:w="120"/>
+              <w:bottom w:type="dxa" w:w="80"/>
+              <w:right w:type="dxa" w:w="120"/>
+            </w:tcMar>
+          </w:tcPr>
+          <w:p>
+            <w:r>
+              <w:rPr>
+                <w:rFonts w:ascii="Arial" w:cs="Arial" w:eastAsia="Arial" w:hAnsi="Arial"/>
+                <w:color w:val="1a1a1a"/>
+                <w:sz w:val="18"/>
+                <w:szCs w:val="18"/>
+              </w:rPr>
+              <w:t xml:space="preserve">/waterschappen</w:t>
+            </w:r>
+          </w:p>
+        </w:tc>
+      </w:tr>
+      <w:tr>
+        <w:tc>
+          <w:tcPr>
+            <w:tcW w:type="dxa" w:w="1800"/>
+            <w:tcBorders>
+              <w:top w:val="single" w:color="CCCCCC" w:sz="1"/>
+              <w:left w:val="single" w:color="CCCCCC" w:sz="1"/>
+              <w:bottom w:val="single" w:color="CCCCCC" w:sz="1"/>
+              <w:right w:val="single" w:color="CCCCCC" w:sz="1"/>
+            </w:tcBorders>
+            <w:tcMar>
+              <w:top w:type="dxa" w:w="80"/>
+              <w:left w:type="dxa" w:w="120"/>
+              <w:bottom w:type="dxa" w:w="80"/>
+              <w:right w:type="dxa" w:w="120"/>
+            </w:tcMar>
+          </w:tcPr>
+          <w:p>
+            <w:r>
+              <w:rPr>
+                <w:rFonts w:ascii="Arial" w:cs="Arial" w:eastAsia="Arial" w:hAnsi="Arial"/>
+                <w:b/>
+                <w:bCs/>
+                <w:color w:val="1a1a1a"/>
+                <w:sz w:val="18"/>
+                <w:szCs w:val="18"/>
+              </w:rPr>
+              <w:t xml:space="preserve">Database</w:t>
+            </w:r>
+          </w:p>
+        </w:tc>
+        <w:tc>
+          <w:tcPr>
+            <w:tcW w:type="dxa" w:w="3613"/>
+            <w:tcBorders>
+              <w:top w:val="single" w:color="CCCCCC" w:sz="1"/>
+              <w:left w:val="single" w:color="CCCCCC" w:sz="1"/>
+              <w:bottom w:val="single" w:color="CCCCCC" w:sz="1"/>
+              <w:right w:val="single" w:color="CCCCCC" w:sz="1"/>
+            </w:tcBorders>
+            <w:tcMar>
+              <w:top w:type="dxa" w:w="80"/>
+              <w:left w:type="dxa" w:w="120"/>
+              <w:bottom w:type="dxa" w:w="80"/>
+              <w:right w:type="dxa" w:w="120"/>
+            </w:tcMar>
+          </w:tcPr>
+          <w:p>
+            <w:r>
+              <w:rPr>
+                <w:rFonts w:ascii="Arial" w:cs="Arial" w:eastAsia="Arial" w:hAnsi="Arial"/>
+                <w:color w:val="1a1a1a"/>
+                <w:sz w:val="18"/>
+                <w:szCs w:val="18"/>
+              </w:rPr>
+              <w:t xml:space="preserve">Neon (eigen project)</w:t>
+            </w:r>
+          </w:p>
+        </w:tc>
+        <w:tc>
+          <w:tcPr>
+            <w:tcW w:type="dxa" w:w="3613"/>
+            <w:tcBorders>
+              <w:top w:val="single" w:color="CCCCCC" w:sz="1"/>
+              <w:left w:val="single" w:color="CCCCCC" w:sz="1"/>
+              <w:bottom w:val="single" w:color="CCCCCC" w:sz="1"/>
+              <w:right w:val="single" w:color="CCCCCC" w:sz="1"/>
+            </w:tcBorders>
+            <w:tcMar>
+              <w:top w:type="dxa" w:w="80"/>
+              <w:left w:type="dxa" w:w="120"/>
+              <w:bottom w:type="dxa" w:w="80"/>
+              <w:right w:type="dxa" w:w="120"/>
+            </w:tcMar>
+          </w:tcPr>
+          <w:p>
+            <w:r>
+              <w:rPr>
+                <w:rFonts w:ascii="Arial" w:cs="Arial" w:eastAsia="Arial" w:hAnsi="Arial"/>
+                <w:color w:val="1a1a1a"/>
+                <w:sz w:val="18"/>
+                <w:szCs w:val="18"/>
+              </w:rPr>
+              <w:t xml:space="preserve">Neon (eigen project)</w:t>
+            </w:r>
+          </w:p>
+        </w:tc>
+      </w:tr>
+      <w:tr>
+        <w:tc>
+          <w:tcPr>
+            <w:tcW w:type="dxa" w:w="1800"/>
+            <w:tcBorders>
+              <w:top w:val="single" w:color="CCCCCC" w:sz="1"/>
+              <w:left w:val="single" w:color="CCCCCC" w:sz="1"/>
+              <w:bottom w:val="single" w:color="CCCCCC" w:sz="1"/>
+              <w:right w:val="single" w:color="CCCCCC" w:sz="1"/>
+            </w:tcBorders>
+            <w:tcMar>
+              <w:top w:type="dxa" w:w="80"/>
+              <w:left w:type="dxa" w:w="120"/>
+              <w:bottom w:type="dxa" w:w="80"/>
+              <w:right w:type="dxa" w:w="120"/>
+            </w:tcMar>
+          </w:tcPr>
+          <w:p>
+            <w:r>
+              <w:rPr>
+                <w:rFonts w:ascii="Arial" w:cs="Arial" w:eastAsia="Arial" w:hAnsi="Arial"/>
+                <w:b/>
+                <w:bCs/>
+                <w:color w:val="1a1a1a"/>
+                <w:sz w:val="18"/>
+                <w:szCs w:val="18"/>
+              </w:rPr>
+              <w:t xml:space="preserve">Gedeelde code</w:t>
+            </w:r>
+          </w:p>
+        </w:tc>
+        <w:tc>
+          <w:tcPr>
+            <w:tcW w:type="dxa" w:w="3613"/>
+            <w:tcBorders>
+              <w:top w:val="single" w:color="CCCCCC" w:sz="1"/>
+              <w:left w:val="single" w:color="CCCCCC" w:sz="1"/>
+              <w:bottom w:val="single" w:color="CCCCCC" w:sz="1"/>
+              <w:right w:val="single" w:color="CCCCCC" w:sz="1"/>
+            </w:tcBorders>
+            <w:shd w:fill="F5F5F5" w:val="clear"/>
+            <w:tcMar>
+              <w:top w:type="dxa" w:w="80"/>
+              <w:left w:type="dxa" w:w="120"/>
+              <w:bottom w:type="dxa" w:w="80"/>
+              <w:right w:type="dxa" w:w="120"/>
+            </w:tcMar>
+          </w:tcPr>
+          <w:p>
+            <w:r>
+              <w:rPr>
+                <w:rFonts w:ascii="Arial" w:cs="Arial" w:eastAsia="Arial" w:hAnsi="Arial"/>
+                <w:color w:val="1a1a1a"/>
+                <w:sz w:val="18"/>
+                <w:szCs w:val="18"/>
+              </w:rPr>
+              <w:t xml:space="preserve">GVC git submodule</w:t>
+            </w:r>
+          </w:p>
+        </w:tc>
+        <w:tc>
+          <w:tcPr>
+            <w:tcW w:type="dxa" w:w="3613"/>
+            <w:tcBorders>
+              <w:top w:val="single" w:color="CCCCCC" w:sz="1"/>
+              <w:left w:val="single" w:color="CCCCCC" w:sz="1"/>
+              <w:bottom w:val="single" w:color="CCCCCC" w:sz="1"/>
+              <w:right w:val="single" w:color="CCCCCC" w:sz="1"/>
+            </w:tcBorders>
+            <w:shd w:fill="F5F5F5" w:val="clear"/>
+            <w:tcMar>
+              <w:top w:type="dxa" w:w="80"/>
+              <w:left w:type="dxa" w:w="120"/>
+              <w:bottom w:type="dxa" w:w="80"/>
+              <w:right w:type="dxa" w:w="120"/>
+            </w:tcMar>
+          </w:tcPr>
+          <w:p>
+            <w:r>
+              <w:rPr>
+                <w:rFonts w:ascii="Arial" w:cs="Arial" w:eastAsia="Arial" w:hAnsi="Arial"/>
+                <w:color w:val="1a1a1a"/>
+                <w:sz w:val="18"/>
+                <w:szCs w:val="18"/>
+              </w:rPr>
+              <w:t xml:space="preserve">GVC git submodule</w:t>
+            </w:r>
+          </w:p>
+        </w:tc>
+      </w:tr>
+    </w:tbl>
+    <w:p>
+      <w:pPr>
+        <w:spacing w:before="80"/>
+      </w:pPr>
     </w:p>
     <w:p>
       <w:pPr>
@@ -10282,11 +10934,127 @@
       <w:r>
         <w:rPr>
           <w:rFonts w:ascii="Arial" w:cs="Arial" w:eastAsia="Arial" w:hAnsi="Arial"/>
+          <w:b/>
+          <w:bCs/>
           <w:color w:val="1a1a1a"/>
           <w:sz w:val="20"/>
           <w:szCs w:val="20"/>
         </w:rPr>
-        <w:t xml:space="preserve">Een eerste waterschappen-variant (HWH) is als proof-of-concept operationeel.</w:t>
+        <w:t xml:space="preserve">Technische realisatie:</w:t>
+      </w:r>
+    </w:p>
+    <w:p>
+      <w:pPr>
+        <w:pStyle w:val="ListParagraph"/>
+        <w:numPr>
+          <w:ilvl w:val="0"/>
+          <w:numId w:val="2"/>
+        </w:numPr>
+        <w:spacing w:after="60"/>
+      </w:pPr>
+      <w:r>
+        <w:rPr>
+          <w:rFonts w:ascii="Arial" w:cs="Arial" w:eastAsia="Arial" w:hAnsi="Arial"/>
+          <w:color w:val="1a1a1a"/>
+          <w:sz w:val="20"/>
+          <w:szCs w:val="20"/>
+        </w:rPr>
+        <w:t xml:space="preserve">Generiek Organisatie-model in Prisma (Gemeente/Waterschap via @@map)</w:t>
+      </w:r>
+    </w:p>
+    <w:p>
+      <w:pPr>
+        <w:pStyle w:val="ListParagraph"/>
+        <w:numPr>
+          <w:ilvl w:val="0"/>
+          <w:numId w:val="2"/>
+        </w:numPr>
+        <w:spacing w:after="60"/>
+      </w:pPr>
+      <w:r>
+        <w:rPr>
+          <w:rFonts w:ascii="Arial" w:cs="Arial" w:eastAsia="Arial" w:hAnsi="Arial"/>
+          <w:color w:val="1a1a1a"/>
+          <w:sz w:val="20"/>
+          <w:szCs w:val="20"/>
+        </w:rPr>
+        <w:t xml:space="preserve">Tenant-configuratie per variant (branding, rollen, routes, sync-bron)</w:t>
+      </w:r>
+    </w:p>
+    <w:p>
+      <w:pPr>
+        <w:pStyle w:val="ListParagraph"/>
+        <w:numPr>
+          <w:ilvl w:val="0"/>
+          <w:numId w:val="2"/>
+        </w:numPr>
+        <w:spacing w:after="60"/>
+      </w:pPr>
+      <w:r>
+        <w:rPr>
+          <w:rFonts w:ascii="Arial" w:cs="Arial" w:eastAsia="Arial" w:hAnsi="Arial"/>
+          <w:color w:val="1a1a1a"/>
+          <w:sz w:val="20"/>
+          <w:szCs w:val="20"/>
+        </w:rPr>
+        <w:t xml:space="preserve">GVC als git submodule — werkt lokaal én op Vercel</w:t>
+      </w:r>
+    </w:p>
+    <w:p>
+      <w:pPr>
+        <w:pStyle w:val="ListParagraph"/>
+        <w:numPr>
+          <w:ilvl w:val="0"/>
+          <w:numId w:val="2"/>
+        </w:numPr>
+        <w:spacing w:after="60"/>
+      </w:pPr>
+      <w:r>
+        <w:rPr>
+          <w:rFonts w:ascii="Arial" w:cs="Arial" w:eastAsia="Arial" w:hAnsi="Arial"/>
+          <w:color w:val="1a1a1a"/>
+          <w:sz w:val="20"/>
+          <w:szCs w:val="20"/>
+        </w:rPr>
+        <w:t xml:space="preserve">WILMA-sync geïmplementeerd met dezelfde Semantic MediaWiki API als GEMMA</w:t>
+      </w:r>
+    </w:p>
+    <w:p>
+      <w:pPr>
+        <w:pStyle w:val="ListParagraph"/>
+        <w:numPr>
+          <w:ilvl w:val="0"/>
+          <w:numId w:val="2"/>
+        </w:numPr>
+        <w:spacing w:after="60"/>
+      </w:pPr>
+      <w:r>
+        <w:rPr>
+          <w:rFonts w:ascii="Arial" w:cs="Arial" w:eastAsia="Arial" w:hAnsi="Arial"/>
+          <w:color w:val="1a1a1a"/>
+          <w:sz w:val="20"/>
+          <w:szCs w:val="20"/>
+        </w:rPr>
+        <w:t xml:space="preserve">264 unit tests, WCAG-audit (0 violations), Zod-validatie, Haven/Helm</w:t>
+      </w:r>
+    </w:p>
+    <w:p>
+      <w:pPr>
+        <w:spacing w:before="40"/>
+      </w:pPr>
+    </w:p>
+    <w:p>
+      <w:pPr>
+        <w:spacing w:after="120"/>
+      </w:pPr>
+      <w:r>
+        <w:rPr>
+          <w:rFonts w:ascii="Arial" w:cs="Arial" w:eastAsia="Arial" w:hAnsi="Arial"/>
+          <w:color w:val="1a1a1a"/>
+          <w:sz w:val="20"/>
+          <w:szCs w:val="20"/>
+        </w:rPr>
+        <w:t xml:space="preserve">Dit model biedt schaalvoordelen: verbeteringen in de GVC komen automatisch beschikbaar voor alle varianten. Nieuwe sectoren (provincies, onderwijs) vereisen alleen een tenant-configuratie en domein-specifieke data.</w:t>
       </w:r>
     </w:p>
     <w:p>

</xml_diff>